<commit_message>
feat: update text size add prezencna listina
</commit_message>
<xml_diff>
--- a/aplikacna_prirucka_ejarmok.docx
+++ b/aplikacna_prirucka_ejarmok.docx
@@ -5,9 +5,33 @@
     <w:p>
       <w:pPr>
         <w:jc w:val="center"/>
-      </w:pPr>
-      <w:r>
+        <w:rPr>
+          <w:sz w:val="32"/>
+          <w:szCs w:val="32"/>
+          <w:lang w:val="sk-SK"/>
+        </w:rPr>
+      </w:pPr>
+      <w:r>
+        <w:rPr>
+          <w:sz w:val="32"/>
+          <w:szCs w:val="32"/>
+        </w:rPr>
         <w:t>APLIKAČNÁ PRÍRUČKA</w:t>
+      </w:r>
+      <w:r>
+        <w:rPr>
+          <w:sz w:val="32"/>
+          <w:szCs w:val="32"/>
+        </w:rPr>
+        <w:t xml:space="preserve"> – PREV</w:t>
+      </w:r>
+      <w:r>
+        <w:rPr>
+          <w:sz w:val="32"/>
+          <w:szCs w:val="32"/>
+          <w:lang w:val="sk-SK"/>
+        </w:rPr>
+        <w:t>ÁDZKOVÁ DOKUMENTÁCIA</w:t>
       </w:r>
     </w:p>
     <w:p>
@@ -2670,16 +2694,7 @@
           <w:szCs w:val="18"/>
           <w:lang w:val="pl-PL"/>
         </w:rPr>
-        <w:t xml:space="preserve">Definovanie zón a </w:t>
-      </w:r>
-      <w:r>
-        <w:rPr>
-          <w:rFonts w:ascii="Tahoma" w:hAnsi="Tahoma" w:cs="Tahoma"/>
-          <w:sz w:val="18"/>
-          <w:szCs w:val="18"/>
-          <w:lang w:val="pl-PL"/>
-        </w:rPr>
-        <w:t>info ikoniek</w:t>
+        <w:t>Definovanie zón a info ikoniek</w:t>
       </w:r>
     </w:p>
     <w:p>
@@ -4594,23 +4609,7 @@
           <w:sz w:val="18"/>
           <w:szCs w:val="18"/>
         </w:rPr>
-        <w:t>P</w:t>
-      </w:r>
-      <w:r>
-        <w:rPr>
-          <w:rFonts w:ascii="Tahoma" w:hAnsi="Tahoma" w:cs="Tahoma"/>
-          <w:sz w:val="18"/>
-          <w:szCs w:val="18"/>
-        </w:rPr>
-        <w:t>otvrdeni</w:t>
-      </w:r>
-      <w:r>
-        <w:rPr>
-          <w:rFonts w:ascii="Tahoma" w:hAnsi="Tahoma" w:cs="Tahoma"/>
-          <w:sz w:val="18"/>
-          <w:szCs w:val="18"/>
-        </w:rPr>
-        <w:t>e</w:t>
+        <w:t>Potvrdenie</w:t>
       </w:r>
       <w:proofErr w:type="spellEnd"/>
       <w:r>
@@ -9582,27 +9581,7 @@
           <w:szCs w:val="16"/>
           <w:lang w:val="pl-PL"/>
         </w:rPr>
-        <w:t xml:space="preserve">TZP -&gt; </w:t>
-      </w:r>
-      <w:r>
-        <w:rPr>
-          <w:rFonts w:ascii="Tahoma" w:hAnsi="Tahoma" w:cs="Tahoma"/>
-          <w:b/>
-          <w:sz w:val="16"/>
-          <w:szCs w:val="16"/>
-          <w:lang w:val="pl-PL"/>
-        </w:rPr>
-        <w:t>61.37</w:t>
-      </w:r>
-      <w:r>
-        <w:rPr>
-          <w:rFonts w:ascii="Tahoma" w:hAnsi="Tahoma" w:cs="Tahoma"/>
-          <w:b/>
-          <w:sz w:val="16"/>
-          <w:szCs w:val="16"/>
-          <w:lang w:val="pl-PL"/>
-        </w:rPr>
-        <w:t>% + 5e Elektrina = 10e / m</w:t>
+        <w:t>TZP -&gt; 61.37% + 5e Elektrina = 10e / m</w:t>
       </w:r>
     </w:p>
     <w:p>
@@ -17783,16 +17762,119 @@
     <w:p>
       <w:pPr>
         <w:rPr>
-          <w:rFonts w:ascii="Calibri" w:hAnsi="Calibri" w:cs="Tahoma"/>
-          <w:b/>
-          <w:color w:val="0070C0"/>
-          <w:sz w:val="16"/>
-          <w:szCs w:val="16"/>
-          <w:lang w:val="sk-SK"/>
-        </w:rPr>
-      </w:pPr>
-    </w:p>
-    <w:p/>
+          <w:sz w:val="18"/>
+          <w:szCs w:val="18"/>
+          <w:lang w:val="pl-PL"/>
+        </w:rPr>
+      </w:pPr>
+      <w:r>
+        <w:rPr>
+          <w:sz w:val="18"/>
+          <w:szCs w:val="18"/>
+          <w:lang w:val="sk-SK"/>
+        </w:rPr>
+        <w:tab/>
+        <w:t>Spolu s</w:t>
+      </w:r>
+      <w:r>
+        <w:rPr>
+          <w:sz w:val="18"/>
+          <w:szCs w:val="18"/>
+          <w:lang w:val="sk-SK"/>
+        </w:rPr>
+        <w:t> </w:t>
+      </w:r>
+      <w:r>
+        <w:rPr>
+          <w:sz w:val="18"/>
+          <w:szCs w:val="18"/>
+          <w:lang w:val="sk-SK"/>
+        </w:rPr>
+        <w:t>aplika</w:t>
+      </w:r>
+      <w:r>
+        <w:rPr>
+          <w:sz w:val="18"/>
+          <w:szCs w:val="18"/>
+          <w:lang w:val="sk-SK"/>
+        </w:rPr>
+        <w:t>č</w:t>
+      </w:r>
+      <w:r>
+        <w:rPr>
+          <w:sz w:val="18"/>
+          <w:szCs w:val="18"/>
+          <w:lang w:val="sk-SK"/>
+        </w:rPr>
+        <w:t>nou dokumentáciu sa odovzdáva aj</w:t>
+      </w:r>
+      <w:r>
+        <w:rPr>
+          <w:sz w:val="18"/>
+          <w:szCs w:val="18"/>
+          <w:lang w:val="pl-PL"/>
+        </w:rPr>
+        <w:t>:</w:t>
+      </w:r>
+    </w:p>
+    <w:p>
+      <w:pPr>
+        <w:ind w:left="720"/>
+        <w:rPr>
+          <w:sz w:val="18"/>
+          <w:szCs w:val="18"/>
+          <w:lang w:val="sk-SK"/>
+        </w:rPr>
+      </w:pPr>
+      <w:r>
+        <w:rPr>
+          <w:sz w:val="18"/>
+          <w:szCs w:val="18"/>
+          <w:lang w:val="pl-PL"/>
+        </w:rPr>
+        <w:t>- Technická dokument</w:t>
+      </w:r>
+      <w:r>
+        <w:rPr>
+          <w:sz w:val="18"/>
+          <w:szCs w:val="18"/>
+          <w:lang w:val="sk-SK"/>
+        </w:rPr>
+        <w:t>ácia</w:t>
+      </w:r>
+    </w:p>
+    <w:p>
+      <w:pPr>
+        <w:ind w:left="720"/>
+        <w:rPr>
+          <w:sz w:val="18"/>
+          <w:szCs w:val="18"/>
+          <w:lang w:val="sk-SK"/>
+        </w:rPr>
+      </w:pPr>
+      <w:r>
+        <w:rPr>
+          <w:sz w:val="18"/>
+          <w:szCs w:val="18"/>
+        </w:rPr>
+        <w:t xml:space="preserve">- </w:t>
+      </w:r>
+      <w:r>
+        <w:rPr>
+          <w:sz w:val="18"/>
+          <w:szCs w:val="18"/>
+          <w:lang w:val="sk-SK"/>
+        </w:rPr>
+        <w:t>Používateľská príručka</w:t>
+      </w:r>
+    </w:p>
+    <w:p>
+      <w:pPr>
+        <w:rPr>
+          <w:lang w:val="pl-PL"/>
+        </w:rPr>
+      </w:pPr>
+    </w:p>
     <w:sectPr>
       <w:pgSz w:w="12240" w:h="15840"/>
       <w:pgMar w:top="1440" w:right="1440" w:bottom="1440" w:left="1440" w:header="708" w:footer="708" w:gutter="0"/>
@@ -22747,6 +22829,7 @@
   <w:style w:type="character" w:default="1" w:styleId="DefaultParagraphFont">
     <w:name w:val="Default Paragraph Font"/>
     <w:uiPriority w:val="1"/>
+    <w:semiHidden/>
     <w:unhideWhenUsed/>
   </w:style>
   <w:style w:type="table" w:default="1" w:styleId="TableNormal">

</xml_diff>